<commit_message>
Update Abstraction Defined document with new content revisions.
</commit_message>
<xml_diff>
--- a/week02/Abstraction Defined.docx
+++ b/week02/Abstraction Defined.docx
@@ -1,6 +1,6 @@
 
 <file path=word/document.xml><?xml version="1.0" encoding="utf-8"?>
-<w:document xmlns:wpc="http://schemas.microsoft.com/office/word/2010/wordprocessingCanvas" xmlns:cx="http://schemas.microsoft.com/office/drawing/2014/chartex" xmlns:cx1="http://schemas.microsoft.com/office/drawing/2015/9/8/chartex" xmlns:cx2="http://schemas.microsoft.com/office/drawing/2015/10/21/chartex" xmlns:cx3="http://schemas.microsoft.com/office/drawing/2016/5/9/chartex" xmlns:cx4="http://schemas.microsoft.com/office/drawing/2016/5/10/chartex" xmlns:cx5="http://schemas.microsoft.com/office/drawing/2016/5/11/chartex" xmlns:cx6="http://schemas.microsoft.com/office/drawing/2016/5/12/chartex" xmlns:cx7="http://schemas.microsoft.com/office/drawing/2016/5/13/chartex" xmlns:cx8="http://schemas.microsoft.com/office/drawing/2016/5/14/chartex" xmlns:mc="http://schemas.openxmlformats.org/markup-compatibility/2006" xmlns:m="http://schemas.openxmlformats.org/officeDocument/2006/math" xmlns:aink="http://schemas.microsoft.com/office/drawing/2016/ink" xmlns:am3d="http://schemas.microsoft.com/office/drawing/2017/model3d" xmlns:oel="http://schemas.microsoft.com/office/2019/extlst" xmlns:r="http://schemas.openxmlformats.org/officeDocument/2006/relationships" xmlns:wp14="http://schemas.microsoft.com/office/word/2010/wordprocessingDrawing" xmlns:wp="http://schemas.openxmlformats.org/drawingml/2006/wordprocessingDrawing" xmlns:wpg="http://schemas.microsoft.com/office/word/2010/wordprocessingGroup" xmlns:wpi="http://schemas.microsoft.com/office/word/2010/wordprocessingInk" xmlns:wps="http://schemas.microsoft.com/office/word/2010/wordprocessingShape" xmlns:o="urn:schemas-microsoft-com:office:office" xmlns:v="urn:schemas-microsoft-com:vml" xmlns:w10="urn:schemas-microsoft-com:office:word" xmlns:w="http://schemas.openxmlformats.org/wordprocessingml/2006/main" xmlns:w14="http://schemas.microsoft.com/office/word/2010/wordml" xmlns:w15="http://schemas.microsoft.com/office/word/2012/wordml" xmlns:w16cex="http://schemas.microsoft.com/office/word/2018/wordml/cex" xmlns:w16cid="http://schemas.microsoft.com/office/word/2016/wordml/cid" xmlns:w16="http://schemas.microsoft.com/office/word/2018/wordml" xmlns:w16sdtdh="http://schemas.microsoft.com/office/word/2020/wordml/sdtdatahash" xmlns:w16sdtfl="http://schemas.microsoft.com/office/word/2024/wordml/sdtformatlock" xmlns:w16se="http://schemas.microsoft.com/office/word/2015/wordml/symex" xmlns:w16du="http://schemas.microsoft.com/office/word/2023/wordml/word16du" xmlns:wne="http://schemas.microsoft.com/office/word/2006/wordml" mc:Ignorable="w14 w15 w16se w16cid w16 w16cex w16sdtdh w16sdtfl w16du wp14">
+<w:document xmlns:wpc="http://schemas.microsoft.com/office/word/2010/wordprocessingCanvas" xmlns:cx="http://schemas.microsoft.com/office/drawing/2014/chartex" xmlns:cx1="http://schemas.microsoft.com/office/drawing/2015/9/8/chartex" xmlns:cx2="http://schemas.microsoft.com/office/drawing/2015/10/21/chartex" xmlns:cx3="http://schemas.microsoft.com/office/drawing/2016/5/9/chartex" xmlns:cx4="http://schemas.microsoft.com/office/drawing/2016/5/10/chartex" xmlns:cx5="http://schemas.microsoft.com/office/drawing/2016/5/11/chartex" xmlns:cx6="http://schemas.microsoft.com/office/drawing/2016/5/12/chartex" xmlns:cx7="http://schemas.microsoft.com/office/drawing/2016/5/13/chartex" xmlns:cx8="http://schemas.microsoft.com/office/drawing/2016/5/14/chartex" xmlns:mc="http://schemas.openxmlformats.org/markup-compatibility/2006" xmlns:m="http://schemas.openxmlformats.org/officeDocument/2006/math" xmlns:aink="http://schemas.microsoft.com/office/drawing/2016/ink" xmlns:am3d="http://schemas.microsoft.com/office/drawing/2017/model3d" xmlns:oel="http://schemas.microsoft.com/office/2019/extlst" xmlns:r="http://schemas.openxmlformats.org/officeDocument/2006/relationships" xmlns:wp14="http://schemas.microsoft.com/office/word/2010/wordprocessingDrawing" xmlns:wp="http://schemas.openxmlformats.org/drawingml/2006/wordprocessingDrawing" xmlns:wpg="http://schemas.microsoft.com/office/word/2010/wordprocessingGroup" xmlns:wpi="http://schemas.microsoft.com/office/word/2010/wordprocessingInk" xmlns:wps="http://schemas.microsoft.com/office/word/2010/wordprocessingShape" xmlns:o="urn:schemas-microsoft-com:office:office" xmlns:v="urn:schemas-microsoft-com:vml" xmlns:w10="urn:schemas-microsoft-com:office:word" xmlns:w="http://schemas.openxmlformats.org/wordprocessingml/2006/main" xmlns:w14="http://schemas.microsoft.com/office/word/2010/wordml" xmlns:w15="http://schemas.microsoft.com/office/word/2012/wordml" xmlns:w16cei="http://schemas.microsoft.com/office/word/2026/wordml/cei" xmlns:w16cex="http://schemas.microsoft.com/office/word/2018/wordml/cex" xmlns:w16cid="http://schemas.microsoft.com/office/word/2016/wordml/cid" xmlns:w16="http://schemas.microsoft.com/office/word/2018/wordml" xmlns:w16sdtdh="http://schemas.microsoft.com/office/word/2020/wordml/sdtdatahash" xmlns:w16sdtfl="http://schemas.microsoft.com/office/word/2024/wordml/sdtformatlock" xmlns:w16se="http://schemas.microsoft.com/office/word/2015/wordml/symex" xmlns:w16du="http://schemas.microsoft.com/office/word/2023/wordml/word16du" xmlns:wne="http://schemas.microsoft.com/office/word/2006/wordml" mc:Ignorable="w14 w15 w16se w16cid w16 w16cex w16sdtdh w16sdtfl w16du wp14">
   <w:body>
     <w:p>
       <w:pPr>
@@ -4204,18 +4204,50 @@
     <w:p/>
     <w:p>
       <w:r>
-        <w:t xml:space="preserve">I missed the attendance of the first meeting </w:t>
-      </w:r>
-      <w:proofErr w:type="gramStart"/>
-      <w:r>
-        <w:t>as a result of</w:t>
-      </w:r>
-      <w:proofErr w:type="gramEnd"/>
-      <w:r>
-        <w:t xml:space="preserve"> misunderstanding that UTC time is a full day ahead. 0</w:t>
-      </w:r>
-      <w:r>
-        <w:t xml:space="preserve">200 Friday really means 9pm central time on Thursday. </w:t>
+        <w:rPr>
+          <w:noProof/>
+        </w:rPr>
+        <w:drawing>
+          <wp:inline distT="0" distB="0" distL="0" distR="0" wp14:anchorId="6060E819" wp14:editId="0FAAC95B">
+            <wp:extent cx="5943600" cy="2544445"/>
+            <wp:effectExtent l="0" t="0" r="0" b="0"/>
+            <wp:docPr id="1183364809" name="Picture 1"/>
+            <wp:cNvGraphicFramePr>
+              <a:graphicFrameLocks xmlns:a="http://schemas.openxmlformats.org/drawingml/2006/main" noChangeAspect="1"/>
+            </wp:cNvGraphicFramePr>
+            <a:graphic xmlns:a="http://schemas.openxmlformats.org/drawingml/2006/main">
+              <a:graphicData uri="http://schemas.openxmlformats.org/drawingml/2006/picture">
+                <pic:pic xmlns:pic="http://schemas.openxmlformats.org/drawingml/2006/picture">
+                  <pic:nvPicPr>
+                    <pic:cNvPr id="1183364809" name="Picture 1183364809"/>
+                    <pic:cNvPicPr/>
+                  </pic:nvPicPr>
+                  <pic:blipFill>
+                    <a:blip r:embed="rId7" cstate="print">
+                      <a:extLst>
+                        <a:ext uri="{28A0092B-C50C-407E-A947-70E740481C1C}">
+                          <a14:useLocalDpi xmlns:a14="http://schemas.microsoft.com/office/drawing/2010/main" val="0"/>
+                        </a:ext>
+                      </a:extLst>
+                    </a:blip>
+                    <a:stretch>
+                      <a:fillRect/>
+                    </a:stretch>
+                  </pic:blipFill>
+                  <pic:spPr>
+                    <a:xfrm>
+                      <a:off x="0" y="0"/>
+                      <a:ext cx="5943600" cy="2544445"/>
+                    </a:xfrm>
+                    <a:prstGeom prst="rect">
+                      <a:avLst/>
+                    </a:prstGeom>
+                  </pic:spPr>
+                </pic:pic>
+              </a:graphicData>
+            </a:graphic>
+          </wp:inline>
+        </w:drawing>
       </w:r>
     </w:p>
     <w:sectPr>
@@ -4229,7 +4261,7 @@
 </file>
 
 <file path=word/endnotes.xml><?xml version="1.0" encoding="utf-8"?>
-<w:endnotes xmlns:wpc="http://schemas.microsoft.com/office/word/2010/wordprocessingCanvas" xmlns:cx="http://schemas.microsoft.com/office/drawing/2014/chartex" xmlns:cx1="http://schemas.microsoft.com/office/drawing/2015/9/8/chartex" xmlns:cx2="http://schemas.microsoft.com/office/drawing/2015/10/21/chartex" xmlns:cx3="http://schemas.microsoft.com/office/drawing/2016/5/9/chartex" xmlns:cx4="http://schemas.microsoft.com/office/drawing/2016/5/10/chartex" xmlns:cx5="http://schemas.microsoft.com/office/drawing/2016/5/11/chartex" xmlns:cx6="http://schemas.microsoft.com/office/drawing/2016/5/12/chartex" xmlns:cx7="http://schemas.microsoft.com/office/drawing/2016/5/13/chartex" xmlns:cx8="http://schemas.microsoft.com/office/drawing/2016/5/14/chartex" xmlns:mc="http://schemas.openxmlformats.org/markup-compatibility/2006" xmlns:m="http://schemas.openxmlformats.org/officeDocument/2006/math" xmlns:aink="http://schemas.microsoft.com/office/drawing/2016/ink" xmlns:am3d="http://schemas.microsoft.com/office/drawing/2017/model3d" xmlns:oel="http://schemas.microsoft.com/office/2019/extlst" xmlns:r="http://schemas.openxmlformats.org/officeDocument/2006/relationships" xmlns:wp14="http://schemas.microsoft.com/office/word/2010/wordprocessingDrawing" xmlns:wp="http://schemas.openxmlformats.org/drawingml/2006/wordprocessingDrawing" xmlns:wpg="http://schemas.microsoft.com/office/word/2010/wordprocessingGroup" xmlns:wpi="http://schemas.microsoft.com/office/word/2010/wordprocessingInk" xmlns:wps="http://schemas.microsoft.com/office/word/2010/wordprocessingShape" xmlns:o="urn:schemas-microsoft-com:office:office" xmlns:v="urn:schemas-microsoft-com:vml" xmlns:w10="urn:schemas-microsoft-com:office:word" xmlns:w="http://schemas.openxmlformats.org/wordprocessingml/2006/main" xmlns:w14="http://schemas.microsoft.com/office/word/2010/wordml" xmlns:w15="http://schemas.microsoft.com/office/word/2012/wordml" xmlns:w16cex="http://schemas.microsoft.com/office/word/2018/wordml/cex" xmlns:w16cid="http://schemas.microsoft.com/office/word/2016/wordml/cid" xmlns:w16="http://schemas.microsoft.com/office/word/2018/wordml" xmlns:w16sdtdh="http://schemas.microsoft.com/office/word/2020/wordml/sdtdatahash" xmlns:w16sdtfl="http://schemas.microsoft.com/office/word/2024/wordml/sdtformatlock" xmlns:w16se="http://schemas.microsoft.com/office/word/2015/wordml/symex" xmlns:w16du="http://schemas.microsoft.com/office/word/2023/wordml/word16du" xmlns:wne="http://schemas.microsoft.com/office/word/2006/wordml" mc:Ignorable="w14 w15 w16se w16cid w16 w16cex w16sdtdh w16sdtfl w16du wp14">
+<w:endnotes xmlns:wpc="http://schemas.microsoft.com/office/word/2010/wordprocessingCanvas" xmlns:cx="http://schemas.microsoft.com/office/drawing/2014/chartex" xmlns:cx1="http://schemas.microsoft.com/office/drawing/2015/9/8/chartex" xmlns:cx2="http://schemas.microsoft.com/office/drawing/2015/10/21/chartex" xmlns:cx3="http://schemas.microsoft.com/office/drawing/2016/5/9/chartex" xmlns:cx4="http://schemas.microsoft.com/office/drawing/2016/5/10/chartex" xmlns:cx5="http://schemas.microsoft.com/office/drawing/2016/5/11/chartex" xmlns:cx6="http://schemas.microsoft.com/office/drawing/2016/5/12/chartex" xmlns:cx7="http://schemas.microsoft.com/office/drawing/2016/5/13/chartex" xmlns:cx8="http://schemas.microsoft.com/office/drawing/2016/5/14/chartex" xmlns:mc="http://schemas.openxmlformats.org/markup-compatibility/2006" xmlns:m="http://schemas.openxmlformats.org/officeDocument/2006/math" xmlns:aink="http://schemas.microsoft.com/office/drawing/2016/ink" xmlns:am3d="http://schemas.microsoft.com/office/drawing/2017/model3d" xmlns:oel="http://schemas.microsoft.com/office/2019/extlst" xmlns:r="http://schemas.openxmlformats.org/officeDocument/2006/relationships" xmlns:wp14="http://schemas.microsoft.com/office/word/2010/wordprocessingDrawing" xmlns:wp="http://schemas.openxmlformats.org/drawingml/2006/wordprocessingDrawing" xmlns:wpg="http://schemas.microsoft.com/office/word/2010/wordprocessingGroup" xmlns:wpi="http://schemas.microsoft.com/office/word/2010/wordprocessingInk" xmlns:wps="http://schemas.microsoft.com/office/word/2010/wordprocessingShape" xmlns:o="urn:schemas-microsoft-com:office:office" xmlns:v="urn:schemas-microsoft-com:vml" xmlns:w10="urn:schemas-microsoft-com:office:word" xmlns:w="http://schemas.openxmlformats.org/wordprocessingml/2006/main" xmlns:w14="http://schemas.microsoft.com/office/word/2010/wordml" xmlns:w15="http://schemas.microsoft.com/office/word/2012/wordml" xmlns:w16cei="http://schemas.microsoft.com/office/word/2026/wordml/cei" xmlns:w16cex="http://schemas.microsoft.com/office/word/2018/wordml/cex" xmlns:w16cid="http://schemas.microsoft.com/office/word/2016/wordml/cid" xmlns:w16="http://schemas.microsoft.com/office/word/2018/wordml" xmlns:w16sdtdh="http://schemas.microsoft.com/office/word/2020/wordml/sdtdatahash" xmlns:w16sdtfl="http://schemas.microsoft.com/office/word/2024/wordml/sdtformatlock" xmlns:w16se="http://schemas.microsoft.com/office/word/2015/wordml/symex" xmlns:w16du="http://schemas.microsoft.com/office/word/2023/wordml/word16du" xmlns:wne="http://schemas.microsoft.com/office/word/2006/wordml" mc:Ignorable="w14 w15 w16se w16cid w16 w16cex w16sdtdh w16sdtfl w16du wp14">
   <w:endnote w:type="separator" w:id="-1">
     <w:p>
       <w:pPr>
@@ -4254,7 +4286,7 @@
 </file>
 
 <file path=word/footnotes.xml><?xml version="1.0" encoding="utf-8"?>
-<w:footnotes xmlns:wpc="http://schemas.microsoft.com/office/word/2010/wordprocessingCanvas" xmlns:cx="http://schemas.microsoft.com/office/drawing/2014/chartex" xmlns:cx1="http://schemas.microsoft.com/office/drawing/2015/9/8/chartex" xmlns:cx2="http://schemas.microsoft.com/office/drawing/2015/10/21/chartex" xmlns:cx3="http://schemas.microsoft.com/office/drawing/2016/5/9/chartex" xmlns:cx4="http://schemas.microsoft.com/office/drawing/2016/5/10/chartex" xmlns:cx5="http://schemas.microsoft.com/office/drawing/2016/5/11/chartex" xmlns:cx6="http://schemas.microsoft.com/office/drawing/2016/5/12/chartex" xmlns:cx7="http://schemas.microsoft.com/office/drawing/2016/5/13/chartex" xmlns:cx8="http://schemas.microsoft.com/office/drawing/2016/5/14/chartex" xmlns:mc="http://schemas.openxmlformats.org/markup-compatibility/2006" xmlns:m="http://schemas.openxmlformats.org/officeDocument/2006/math" xmlns:aink="http://schemas.microsoft.com/office/drawing/2016/ink" xmlns:am3d="http://schemas.microsoft.com/office/drawing/2017/model3d" xmlns:oel="http://schemas.microsoft.com/office/2019/extlst" xmlns:r="http://schemas.openxmlformats.org/officeDocument/2006/relationships" xmlns:wp14="http://schemas.microsoft.com/office/word/2010/wordprocessingDrawing" xmlns:wp="http://schemas.openxmlformats.org/drawingml/2006/wordprocessingDrawing" xmlns:wpg="http://schemas.microsoft.com/office/word/2010/wordprocessingGroup" xmlns:wpi="http://schemas.microsoft.com/office/word/2010/wordprocessingInk" xmlns:wps="http://schemas.microsoft.com/office/word/2010/wordprocessingShape" xmlns:o="urn:schemas-microsoft-com:office:office" xmlns:v="urn:schemas-microsoft-com:vml" xmlns:w10="urn:schemas-microsoft-com:office:word" xmlns:w="http://schemas.openxmlformats.org/wordprocessingml/2006/main" xmlns:w14="http://schemas.microsoft.com/office/word/2010/wordml" xmlns:w15="http://schemas.microsoft.com/office/word/2012/wordml" xmlns:w16cex="http://schemas.microsoft.com/office/word/2018/wordml/cex" xmlns:w16cid="http://schemas.microsoft.com/office/word/2016/wordml/cid" xmlns:w16="http://schemas.microsoft.com/office/word/2018/wordml" xmlns:w16sdtdh="http://schemas.microsoft.com/office/word/2020/wordml/sdtdatahash" xmlns:w16sdtfl="http://schemas.microsoft.com/office/word/2024/wordml/sdtformatlock" xmlns:w16se="http://schemas.microsoft.com/office/word/2015/wordml/symex" xmlns:w16du="http://schemas.microsoft.com/office/word/2023/wordml/word16du" xmlns:wne="http://schemas.microsoft.com/office/word/2006/wordml" mc:Ignorable="w14 w15 w16se w16cid w16 w16cex w16sdtdh w16sdtfl w16du wp14">
+<w:footnotes xmlns:wpc="http://schemas.microsoft.com/office/word/2010/wordprocessingCanvas" xmlns:cx="http://schemas.microsoft.com/office/drawing/2014/chartex" xmlns:cx1="http://schemas.microsoft.com/office/drawing/2015/9/8/chartex" xmlns:cx2="http://schemas.microsoft.com/office/drawing/2015/10/21/chartex" xmlns:cx3="http://schemas.microsoft.com/office/drawing/2016/5/9/chartex" xmlns:cx4="http://schemas.microsoft.com/office/drawing/2016/5/10/chartex" xmlns:cx5="http://schemas.microsoft.com/office/drawing/2016/5/11/chartex" xmlns:cx6="http://schemas.microsoft.com/office/drawing/2016/5/12/chartex" xmlns:cx7="http://schemas.microsoft.com/office/drawing/2016/5/13/chartex" xmlns:cx8="http://schemas.microsoft.com/office/drawing/2016/5/14/chartex" xmlns:mc="http://schemas.openxmlformats.org/markup-compatibility/2006" xmlns:m="http://schemas.openxmlformats.org/officeDocument/2006/math" xmlns:aink="http://schemas.microsoft.com/office/drawing/2016/ink" xmlns:am3d="http://schemas.microsoft.com/office/drawing/2017/model3d" xmlns:oel="http://schemas.microsoft.com/office/2019/extlst" xmlns:r="http://schemas.openxmlformats.org/officeDocument/2006/relationships" xmlns:wp14="http://schemas.microsoft.com/office/word/2010/wordprocessingDrawing" xmlns:wp="http://schemas.openxmlformats.org/drawingml/2006/wordprocessingDrawing" xmlns:wpg="http://schemas.microsoft.com/office/word/2010/wordprocessingGroup" xmlns:wpi="http://schemas.microsoft.com/office/word/2010/wordprocessingInk" xmlns:wps="http://schemas.microsoft.com/office/word/2010/wordprocessingShape" xmlns:o="urn:schemas-microsoft-com:office:office" xmlns:v="urn:schemas-microsoft-com:vml" xmlns:w10="urn:schemas-microsoft-com:office:word" xmlns:w="http://schemas.openxmlformats.org/wordprocessingml/2006/main" xmlns:w14="http://schemas.microsoft.com/office/word/2010/wordml" xmlns:w15="http://schemas.microsoft.com/office/word/2012/wordml" xmlns:w16cei="http://schemas.microsoft.com/office/word/2026/wordml/cei" xmlns:w16cex="http://schemas.microsoft.com/office/word/2018/wordml/cex" xmlns:w16cid="http://schemas.microsoft.com/office/word/2016/wordml/cid" xmlns:w16="http://schemas.microsoft.com/office/word/2018/wordml" xmlns:w16sdtdh="http://schemas.microsoft.com/office/word/2020/wordml/sdtdatahash" xmlns:w16sdtfl="http://schemas.microsoft.com/office/word/2024/wordml/sdtformatlock" xmlns:w16se="http://schemas.microsoft.com/office/word/2015/wordml/symex" xmlns:w16du="http://schemas.microsoft.com/office/word/2023/wordml/word16du" xmlns:wne="http://schemas.microsoft.com/office/word/2006/wordml" mc:Ignorable="w14 w15 w16se w16cid w16 w16cex w16sdtdh w16sdtfl w16du wp14">
   <w:footnote w:type="separator" w:id="-1">
     <w:p>
       <w:pPr>
@@ -4279,7 +4311,7 @@
 </file>
 
 <file path=word/numbering.xml><?xml version="1.0" encoding="utf-8"?>
-<w:numbering xmlns:wpc="http://schemas.microsoft.com/office/word/2010/wordprocessingCanvas" xmlns:cx="http://schemas.microsoft.com/office/drawing/2014/chartex" xmlns:cx1="http://schemas.microsoft.com/office/drawing/2015/9/8/chartex" xmlns:cx2="http://schemas.microsoft.com/office/drawing/2015/10/21/chartex" xmlns:cx3="http://schemas.microsoft.com/office/drawing/2016/5/9/chartex" xmlns:cx4="http://schemas.microsoft.com/office/drawing/2016/5/10/chartex" xmlns:cx5="http://schemas.microsoft.com/office/drawing/2016/5/11/chartex" xmlns:cx6="http://schemas.microsoft.com/office/drawing/2016/5/12/chartex" xmlns:cx7="http://schemas.microsoft.com/office/drawing/2016/5/13/chartex" xmlns:cx8="http://schemas.microsoft.com/office/drawing/2016/5/14/chartex" xmlns:mc="http://schemas.openxmlformats.org/markup-compatibility/2006" xmlns:m="http://schemas.openxmlformats.org/officeDocument/2006/math" xmlns:aink="http://schemas.microsoft.com/office/drawing/2016/ink" xmlns:am3d="http://schemas.microsoft.com/office/drawing/2017/model3d" xmlns:oel="http://schemas.microsoft.com/office/2019/extlst" xmlns:r="http://schemas.openxmlformats.org/officeDocument/2006/relationships" xmlns:wp14="http://schemas.microsoft.com/office/word/2010/wordprocessingDrawing" xmlns:wp="http://schemas.openxmlformats.org/drawingml/2006/wordprocessingDrawing" xmlns:wpg="http://schemas.microsoft.com/office/word/2010/wordprocessingGroup" xmlns:wpi="http://schemas.microsoft.com/office/word/2010/wordprocessingInk" xmlns:wps="http://schemas.microsoft.com/office/word/2010/wordprocessingShape" xmlns:o="urn:schemas-microsoft-com:office:office" xmlns:v="urn:schemas-microsoft-com:vml" xmlns:w10="urn:schemas-microsoft-com:office:word" xmlns:w="http://schemas.openxmlformats.org/wordprocessingml/2006/main" xmlns:w14="http://schemas.microsoft.com/office/word/2010/wordml" xmlns:w15="http://schemas.microsoft.com/office/word/2012/wordml" xmlns:w16cex="http://schemas.microsoft.com/office/word/2018/wordml/cex" xmlns:w16cid="http://schemas.microsoft.com/office/word/2016/wordml/cid" xmlns:w16="http://schemas.microsoft.com/office/word/2018/wordml" xmlns:w16sdtdh="http://schemas.microsoft.com/office/word/2020/wordml/sdtdatahash" xmlns:w16sdtfl="http://schemas.microsoft.com/office/word/2024/wordml/sdtformatlock" xmlns:w16se="http://schemas.microsoft.com/office/word/2015/wordml/symex" xmlns:w16du="http://schemas.microsoft.com/office/word/2023/wordml/word16du" xmlns:wne="http://schemas.microsoft.com/office/word/2006/wordml" mc:Ignorable="w14 w15 w16se w16cid w16 w16cex w16sdtdh w16sdtfl w16du wp14">
+<w:numbering xmlns:wpc="http://schemas.microsoft.com/office/word/2010/wordprocessingCanvas" xmlns:cx="http://schemas.microsoft.com/office/drawing/2014/chartex" xmlns:cx1="http://schemas.microsoft.com/office/drawing/2015/9/8/chartex" xmlns:cx2="http://schemas.microsoft.com/office/drawing/2015/10/21/chartex" xmlns:cx3="http://schemas.microsoft.com/office/drawing/2016/5/9/chartex" xmlns:cx4="http://schemas.microsoft.com/office/drawing/2016/5/10/chartex" xmlns:cx5="http://schemas.microsoft.com/office/drawing/2016/5/11/chartex" xmlns:cx6="http://schemas.microsoft.com/office/drawing/2016/5/12/chartex" xmlns:cx7="http://schemas.microsoft.com/office/drawing/2016/5/13/chartex" xmlns:cx8="http://schemas.microsoft.com/office/drawing/2016/5/14/chartex" xmlns:mc="http://schemas.openxmlformats.org/markup-compatibility/2006" xmlns:m="http://schemas.openxmlformats.org/officeDocument/2006/math" xmlns:aink="http://schemas.microsoft.com/office/drawing/2016/ink" xmlns:am3d="http://schemas.microsoft.com/office/drawing/2017/model3d" xmlns:oel="http://schemas.microsoft.com/office/2019/extlst" xmlns:r="http://schemas.openxmlformats.org/officeDocument/2006/relationships" xmlns:wp14="http://schemas.microsoft.com/office/word/2010/wordprocessingDrawing" xmlns:wp="http://schemas.openxmlformats.org/drawingml/2006/wordprocessingDrawing" xmlns:wpg="http://schemas.microsoft.com/office/word/2010/wordprocessingGroup" xmlns:wpi="http://schemas.microsoft.com/office/word/2010/wordprocessingInk" xmlns:wps="http://schemas.microsoft.com/office/word/2010/wordprocessingShape" xmlns:o="urn:schemas-microsoft-com:office:office" xmlns:v="urn:schemas-microsoft-com:vml" xmlns:w10="urn:schemas-microsoft-com:office:word" xmlns:w="http://schemas.openxmlformats.org/wordprocessingml/2006/main" xmlns:w14="http://schemas.microsoft.com/office/word/2010/wordml" xmlns:w15="http://schemas.microsoft.com/office/word/2012/wordml" xmlns:w16cei="http://schemas.microsoft.com/office/word/2026/wordml/cei" xmlns:w16cex="http://schemas.microsoft.com/office/word/2018/wordml/cex" xmlns:w16cid="http://schemas.microsoft.com/office/word/2016/wordml/cid" xmlns:w16="http://schemas.microsoft.com/office/word/2018/wordml" xmlns:w16sdtdh="http://schemas.microsoft.com/office/word/2020/wordml/sdtdatahash" xmlns:w16sdtfl="http://schemas.microsoft.com/office/word/2024/wordml/sdtformatlock" xmlns:w16se="http://schemas.microsoft.com/office/word/2015/wordml/symex" xmlns:w16du="http://schemas.microsoft.com/office/word/2023/wordml/word16du" xmlns:wne="http://schemas.microsoft.com/office/word/2006/wordml" mc:Ignorable="w14 w15 w16se w16cid w16 w16cex w16sdtdh w16sdtfl w16du wp14">
   <w:abstractNum w:abstractNumId="0" w15:restartNumberingAfterBreak="0">
     <w:nsid w:val="547378D7"/>
     <w:multiLevelType w:val="hybridMultilevel"/>

</xml_diff>